<commit_message>
Strengthen Chapter 2 interpretation and add memory-group diagnostics
Clarify historical reweighting, geographic concentration and interval interpretation. Add reproducible memory-versus-other-chip volatility diagnostics, preserve the primary model, and verify the revised 38-page chapter.
</commit_message>
<xml_diff>
--- a/research/02_chip_trade/documents/chapter2.docx
+++ b/research/02_chip_trade/documents/chapter2.docx
@@ -20,7 +20,7 @@
     </w:p>
     <w:p>
       <w:r>
-        <w:t>Рассмотренные в первой главе подходы показывают, что связь экспортной диверсификации с волатильностью зависит как от состава поставок, так и от совместной динамики отдельных потоков. Для эмпирической оценки этой связи необходимо сопоставить различные экспортные структуры на общей истории колебаний. В настоящем исследовании такой анализ проводится для Японии и Республики Корея. Последовательность расчетов включает описание наблюдаемых изменений, оценку условной волатильности при фиксированных весах и разделение товарного и географического вкладов в ее изменение.</w:t>
+        <w:t>Рассмотренные в первой главе подходы показывают, что связь экспортной диверсификации с волатильностью зависит как от состава поставок, так и от совместной динамики отдельных потоков. Для эмпирической оценки этой связи необходимо сопоставить различные экспортные структуры на общей истории колебаний. В настоящем исследовании такой анализ проводится для Японии и Республики Корея. Используется модель исторического перевзвешивания и декомпозиции дисперсии. Последовательность расчетов включает описание наблюдаемых изменений, оценку условной волатильности при фиксированных весах и разделение товарного и географического вкладов в ее изменение.</w:t>
       </w:r>
     </w:p>
     <w:p>
@@ -53,7 +53,7 @@
     </w:p>
     <w:p>
       <w:r>
-        <w:t>Основная товарная совокупность включает четыре шестизначные позиции Гармонизированной системы: процессоры и контроллеры HS854231, память HS854232, усилители HS854233 и прочие интегральные схемы HS854239. Позиция HS854290, объединяющая части интегральных схем, используется при проверке чувствительности. Товарная позиция HS8542 служит для контроля полноты сумм. Таким образом, основной расчет относится к готовым интегральным схемам в принятой классификации, а не ко всему полупроводниковому производству. В него не входят производственное оборудование, материалы и иные категории полупроводниковой продукции.</w:t>
+        <w:t>Основная товарная совокупность включает четыре шестизначные позиции Гармонизированной системы: процессоры и контроллеры HS854231, память HS854232, усилители HS854233 и прочие интегральные схемы HS854239. Позиция HS854290, объединяющая части интегральных схем, используется при проверке чувствительности. Товарная позиция HS8542 служит для контроля полноты сумм. Таким образом, основной расчет охватывает интегральные схемы без отдельно учитываемых частей. Это таможенное определение товарной совокупности, которое не характеризует степень завершенности всех производственных операций. В него не входят производственное оборудование, материалы и иные категории полупроводниковой продукции.</w:t>
       </w:r>
     </w:p>
     <w:p>
@@ -792,6 +792,9 @@
       </w:r>
     </w:p>
     <w:p>
+      <w:pPr>
+        <w:keepNext/>
+      </w:pPr>
       <w:r>
         <w:t xml:space="preserve">Для оценки относительной динамики используется симметричный темп изменения стоимости по сравнению с соответствующим месяцем предыдущего года. Пусть </w:t>
       </w:r>
@@ -1010,7 +1013,12 @@
     </w:p>
     <w:p>
       <w:r>
-        <w:t>Для каждого кандидата проверяется наличие определенных годовых темпов во всех четырех категориях и у обоих экспортеров за 2018–2024 годы. При нарушении этого условия направление должно объединяться с остатком для обеих стран. В основной оценке все восемь кандидатов прошли проверку: Китай, Гонконг, Other Asia, nes, Вьетнам, Сингапур, Филиппины, США и Таиланд. Вместе с остаточной группой они образуют девять направлений и 36 сочетаний товара и направления. Название Other Asia, nes сохранено в соответствии с источником. Проверка наблюдаемости использует всю выбранную историю, поэтому сетка предназначена для исторического анализа. Под направлением понимается статистический торговый партнер; его нельзя автоматически отождествлять с рынком конечного потребления изделий, в которых используются чипы.</w:t>
+        <w:t>Для каждого кандидата проверяется наличие определенных годовых темпов во всех четырех категориях и у обоих экспортеров за 2018–2024 годы. При нарушении этого условия направление должно объединяться с остатком для обеих стран. В основной оценке все восемь кандидатов прошли проверку: Китай, Гонконг, Other Asia, nes, Вьетнам, Сингапур, Филиппины, США и Таиланд. Вместе с остаточной группой они образуют девять направлений и 36 сочетаний товара и направления. Проверка наблюдаемости использует всю выбранную историю, поэтому сетка предназначена для исторического анализа.</w:t>
+      </w:r>
+    </w:p>
+    <w:p>
+      <w:r>
+        <w:t>Направление Other Asia, nes имеет код 490. Согласно пояснению UN Comtrade, под ним учитывается торговля с Тайванем; формально код допускает также другие азиатские территории, не указанные отдельно. Поэтому в таблицах и расчетах сохраняется исходное название. Этот код не совпадает с остаточной группой модели, в которую объединены все невыделенные партнеры. Под направлением в целом понимается статистический торговый партнер, а не обязательно рынок конечного потребления изделий, в которых используются чипы.</w:t>
       </w:r>
       <w:r>
         <w:rPr>
@@ -1021,6 +1029,9 @@
       <w:r/>
     </w:p>
     <w:p>
+      <w:pPr>
+        <w:keepNext/>
+      </w:pPr>
       <w:r>
         <w:t xml:space="preserve">Годовые веса строятся из сумм месячной стоимости. Обозначим такую сумму для ячейки через </w:t>
       </w:r>
@@ -1337,10 +1348,18 @@
     </w:p>
     <w:p>
       <w:r>
-        <w:t>Вес товарно-географической ячейки равен произведению этих долей. Такое представление сохраняет различие между изменением удельного веса товара и перераспределением его поставок между направлениями. Для описания структуры рассчитываются товарный и географический индексы Херфиндаля — Хиршмана как суммы квадратов соответствующих долей. Используется шкала до единицы; минимум товарного индекса для четырех равновеликих категорий составляет 0,25. Географическая концентрация дополнительно оценивается на всех исходных направлениях и на укрупненной сетке модели. Объединение небольших направлений в остаток повышает концентрацию, поэтому уровни индекса сопоставляются при одинаковом способе группировки.</w:t>
+        <w:t>Вес товарно-географической ячейки равен произведению этих долей. Такое представление сохраняет различие между изменением удельного веса товара и перераспределением его поставок между направлениями. Для описания структуры рассчитываются товарный и географический индексы Херфиндаля — Хиршмана как суммы квадратов соответствующих долей. Используется шкала до единицы; минимум товарного индекса для четырех равновеликих категорий составляет 0,25. Географическая концентрация дополнительно оценивается на всех исходных направлениях и на укрупненной сетке модели. Объединение нескольких направлений с положительными долями в остаток повышает концентрацию, поэтому уровни индекса сопоставляются при одинаковом способе группировки.</w:t>
       </w:r>
     </w:p>
     <w:p>
+      <w:r>
+        <w:t>Совокупная доля направления складывается из его долей внутри товаров, взвешенных по удельному весу каждой категории. Поэтому географический HHI способен измениться даже при неизменных долях направлений внутри каждого товара — только вследствие изменения товарного состава. В модели самостоятельный географический вклад определяется заменой именно внутритоварных долей. Это разграничение связывает описательные показатели с последующим разложением и исключает прямое отождествление изменения географического HHI с географическим вкладом в дисперсию.</w:t>
+      </w:r>
+    </w:p>
+    <w:p>
+      <w:pPr>
+        <w:keepNext/>
+      </w:pPr>
       <w:r>
         <w:t xml:space="preserve">Основное сравнение относится к структурам 2017 и 2024 годов. Для отделения двух измерений строятся также состояния, в которых изменяется только товарный состав или только география внутри товаров. Обозначим начальный год как </w:t>
       </w:r>
@@ -2392,10 +2411,13 @@
         </m:sSubSup>
       </m:oMath>
       <w:r>
-        <w:t xml:space="preserve"> веса зафиксированы на протяжении всей истории. Благодаря этому различия между четырьмя состояниями связаны с их структурой при одинаковых наблюдаемых темпах. Дата 2024 в обозначении весов не означает, что волатильность оценивается только по двенадцати месяцам этого года.</w:t>
+        <w:t xml:space="preserve"> веса зафиксированы на протяжении всей истории. Благодаря этому различия между четырьмя состояниями связаны с их структурой при одинаковых наблюдаемых темпах. Дата 2024 в обозначении весов не означает, что волатильность оценивается только по двенадцати месяцам этого года. Слово «условная» далее указывает на фиксацию структуры и истории колебаний; прогнозная условная дисперсия на следующий месяц здесь не оценивается.</w:t>
       </w:r>
     </w:p>
     <w:p>
+      <w:pPr>
+        <w:keepNext/>
+      </w:pPr>
       <w:r>
         <w:t xml:space="preserve">Для каждой страны по 84 наблюдениям рассчитывается выборочная матрица ковариаций темпов </w:t>
       </w:r>
@@ -2704,7 +2726,7 @@
         </m:sSubSup>
       </m:oMath>
       <w:r>
-        <w:t>. Матрицы двух экспортеров оцениваются раздельно; основным объектом сравнения являются изменения внутри каждой страны.</w:t>
+        <w:t>. Дисперсия характеризует отклонения в обе стороны от среднего: ее снижение не равнозначно снижению вероятности экспортного спада или потерь заданного размера. Матрицы двух экспортеров оцениваются раздельно; основным объектом сравнения являются изменения внутри каждой страны.</w:t>
       </w:r>
     </w:p>
     <w:p>
@@ -2713,6 +2735,9 @@
       </w:r>
     </w:p>
     <w:p>
+      <w:pPr>
+        <w:keepNext/>
+      </w:pPr>
       <w:r>
         <w:t>Изменение дисперсии между конечной и исходной структурами разделяется по принципу Шепли. Как показано в работе Shorrocks, усреднение предельных вкладов по возможным порядкам замены позволяет получить точное аддитивное разложение.</w:t>
       </w:r>
@@ -3197,7 +3222,7 @@
     </w:p>
     <w:p>
       <w:r>
-        <w:t>В повторных выборках переоцениваются дисперсии четырех индексов, их разность и оба вклада. Границами 95%-интервала служат квантили 2,5 и 97,5% распределения соответствующей статистики. Интервал разности рассчитывается по разностям внутри повторов, а не вычитанием границ интервалов отдельных состояний. Веса и географическая сетка при этом фиксированы. Полученные интервалы характеризуют вариацию оценки на выбранной истории и не охватывают всю неопределенность статистического учета и структурных изменений. Семь лет темпов содержат ограниченное число отраслевых циклов, что учитывается при интерпретации результатов.</w:t>
+        <w:t>В повторных выборках переоцениваются дисперсии четырех индексов, их разность и оба вклада. Границами 95%-интервала служат квантили 2,5 и 97,5% распределения соответствующей статистики. Интервал разности рассчитывается по разностям внутри повторов, а не вычитанием границ интервалов отдельных состояний. Веса и географическая сетка при этом фиксированы. Полученные интервалы характеризуют вариацию оценки на выбранной истории и не охватывают всю неопределенность статистического учета и структурных изменений. Число повторов уточняет приближение бутстреп-распределения, но не увеличивает объем исходной информации: семь лет темпов содержат ограниченное число отраслевых циклов.</w:t>
       </w:r>
     </w:p>
     <w:p>
@@ -3215,7 +3240,7 @@
     </w:p>
     <w:p>
       <w:r>
-        <w:t>Сравнение экспортной динамики позволяет установить, какие структурные изменения лежат в основе последующей оценки волатильности. Рассматриваются четыре категории готовых интегральных схем, определенные в разделе 2.1. Все стоимостные показатели рассчитаны суммированием месячных поставок из одной базы UN Comtrade. Поэтому описательная часть и модель относятся к одинаковой товарной совокупности. Анализ последовательно охватывает масштаб экспорта, его колебания, товарный состав и распределение по направлениям.</w:t>
+        <w:t>Сравнение экспортной динамики позволяет установить, какие структурные изменения лежат в основе последующей оценки волатильности. Рассматриваются четыре категории интегральных схем без отдельно учитываемых частей, определенные в разделе 2.1. Все стоимостные показатели рассчитаны суммированием месячных поставок из одной базы UN Comtrade. Поэтому описательная часть и модель относятся к одинаковой товарной совокупности. Анализ последовательно охватывает масштаб экспорта, его колебания, товарный состав и распределение по направлениям.</w:t>
       </w:r>
     </w:p>
     <w:p>
@@ -3310,7 +3335,7 @@
           <w:color w:val="000000"/>
           <w:sz w:val="20"/>
         </w:rPr>
-        <w:t>Примечание: Верхняя панель — годовые суммы; нижняя — месячные темпы год к году. Четыре категории готовых схем; текущие доллары США.</w:t>
+        <w:t>Примечание: Верхняя панель — годовые суммы; нижняя — месячные темпы год к году. Четыре категории интегральных схем без частей; текущие доллары США.</w:t>
       </w:r>
     </w:p>
     <w:p>
@@ -3355,7 +3380,7 @@
     </w:p>
     <w:p>
       <w:r>
-        <w:t>Разложение прироста стоимостей уточняет масштаб этого перераспределения. Из общего увеличения корейского экспорта на 33,98 млрд долл. на процессоры и контроллеры приходится 14,49 млрд долл., или 42,63%, на память — 11,51 млрд долл., или 33,88%, на прочие схемы — 7,80 млрд долл., или 22,96%. Остальная часть относится к усилителям. Это бухгалтерское разделение изменения стоимости между категориями. Оно показывает, что расширение экспорта обеспечивалось несколькими товарными группами и что снижение доли памяти возникло при ее положительном вкладе в общий прирост.</w:t>
+        <w:t>Разложение прироста стоимостей уточняет масштаб этого перераспределения. Из общего увеличения корейского экспорта на 33,98 млрд долл. на процессоры и контроллеры приходится 14,49 млрд долл., или 42,63%, на память — 11,51 млрд долл., или 33,88%, на прочие схемы — 7,80 млрд долл., или 22,96%. Остальная часть относится к усилителям. Это арифметическое разложение изменения стоимости между категориями. Оно показывает, что расширение экспорта обеспечивалось несколькими товарными группами и что снижение доли памяти возникло при ее положительном вкладе в общий прирост.</w:t>
       </w:r>
     </w:p>
     <w:p>
@@ -4760,7 +4785,7 @@
     </w:p>
     <w:p>
       <w:r>
-        <w:t>Для Кореи оба вида концентрации между крайними годами снизились: товарный HHI — с 0,5609 до 0,4604, географический по всем направлениям — с 0,2705 до 0,2125. Для Японии снижение географического HHI было небольшим, с 0,1587 до 0,1541, тогда как товарный HHI повысился с 0,3647 до 0,4099. Поэтому описание двух стран единой формулировкой о диверсификации было бы неточным. В Корее уменьшилась концентрация по обоим измерениям, в Японии расширение географического распределения сочеталось с усилением концентрации внутри рассматриваемой товарной совокупности.</w:t>
+        <w:t>Для Кореи оба вида концентрации между крайними годами снизились: товарный HHI — с 0,5609 до 0,4604, географический по всем направлениям — с 0,2705 до 0,2125. Для Японии снижение географического HHI было небольшим, с 0,1587 до 0,1541, тогда как товарный HHI повысился с 0,3647 до 0,4099. Поэтому описание двух стран единой формулировкой о диверсификации было бы неточным. В Корее уменьшилась концентрация по обоим измерениям, в Японии небольшое снижение концентрации направлений сочеталось с ее усилением внутри рассматриваемой товарной совокупности.</w:t>
       </w:r>
     </w:p>
     <w:p>
@@ -5828,7 +5853,7 @@
     </w:p>
     <w:p>
       <w:r>
-        <w:t>Средние темпы условных индексов также различаются: при переходе от состояния 00 к 11 японское значение увеличивается с 1,12 до 4,18 п.п., корейское — с 1,81 до 7,65 п.п. Полные характеристики четырех состояний приведены в приложении Б. Это арифметические средние фиксированных индексов на общей истории, а не фактический среднегодовой прирост стоимости или ожидаемая доходность структуры. Поэтому уменьшение дисперсии рассматривается как отдельная характеристика. Модель не определяет оптимальные доли, поскольку не включает прибыльность, затраты на освоение продукции и ограничения изменения торговых связей.</w:t>
+        <w:t>Средние темпы условных индексов также различаются: при переходе от состояния 00 к 11 японское значение увеличивается с 1,12 до 4,18 п.п., корейское — с 1,81 до 7,65 п.п. Полные характеристики четырех состояний приведены в приложении Б. Это арифметические средние фиксированных индексов на общей истории, а не фактический среднегодовой прирост стоимости. Веса 2024 года известны после реализации этой истории, поэтому более высокий средний индекс не доказывает доступного заранее преимущества стратегии. Модель не определяет оптимальные доли: в нее не включены прибыльность, затраты на освоение продукции и ограничения изменения торговых связей.</w:t>
       </w:r>
     </w:p>
     <w:p>
@@ -5949,6 +5974,16 @@
     </w:p>
     <w:p>
       <w:r>
+        <w:t>Экономическое основание этого разделения видно при сопоставлении двух укрупненных индексов — памяти и остальных схем. Они построены из тех же ячеек при фиксированных долях направлений; доли трех категорий внутри второй группы нормированы к единице. Для Кореи при весах 2017 года стандартное отклонение индекса памяти составляет 38,34 п.п., остальных схем — 16,42 п.п.; при весах 2024 года — 40,12 и 18,78 п.п. соответственно. Корреляция двух индексов положительна: 0,52 и 0,50. Таким образом, память отличается более сильными колебаниями, а остальные категории лишь частично воспроизводят ее динамику. Снижение доли памяти в исследуемом диапазоне уменьшает вес более изменчивой составляющей. При этом сама память к конечной географии не становится менее волатильной. Определение укрупненных индексов и численные результаты приведены в приложении Д.</w:t>
+      </w:r>
+    </w:p>
+    <w:p>
+      <w:r>
+        <w:t>У Японии индекс памяти также более волатилен: 19,31 п.п. против 9,61 п.п. для остальных схем при весах 2017 года и 17,36 против 10,03 п.п. при весах 2024 года. Корреляция групп составляет лишь 0,11 и 0,09. Однако доля памяти в японском экспорте увеличилась. Это помогает объяснить противоположный знак ее структурного вклада. Сопоставление не сводится к одному различию стандартных отклонений: общий результат зависит от размера доли, ковариации групп и изменения пропорций внутри остальных категорий.</w:t>
+      </w:r>
+    </w:p>
+    <w:p>
+      <w:r>
         <w:t>Дополнительные расчеты по памяти, направлениям и ковариационным составляющим выполнялись после рассмотрения основной оценки и имеют объясняющий, поисковый характер. Их интервалы получены тем же способом повторного выбора наблюдений, но не скорректированы на множественное сопоставление детальных результатов. Поэтому они используются для установления того, какие элементы формируют рассчитанный вклад, с сохранением различия между основным выводом и его последующей детализацией.</w:t>
       </w:r>
     </w:p>
@@ -5959,12 +5994,12 @@
     </w:p>
     <w:p>
       <w:r>
-        <w:t>Такое разложение имеет более узкий смысл, чем утверждение о диверсификации производства. Как показано в разделе 2.2, корейская экспортная стоимость памяти между крайними годами выросла, несмотря на сокращение доли. Модель устанавливает значение относительного веса категории при наблюдавшейся истории темпов. Она не разделяет физический выпуск, цены, качество продукции и изменение состава самой памяти. Тем более из HS854232 нельзя непосредственно выделить самостоятельные вклады HBM, DRAM или NAND. Для таких выводов потребовалась бы другая детализация данных.</w:t>
+        <w:t>Уменьшение относительного веса памяти, как показано в разделе 2.2, происходило при росте стоимости ее экспорта. Поэтому результат характеризует соотношение товарных групп, а не сокращение выпуска памяти. Внутри HS854232 сохраняется смешение ценовой, количественной и технологической динамики; самостоятельные вклады HBM, DRAM или NAND по этому коду не определяются.</w:t>
       </w:r>
     </w:p>
     <w:p>
       <w:r>
-        <w:t>Японское разложение показывает противоположное направление. Увеличению доли памяти соответствует вклад +5,88 п.п.² с интервалом [0,97; 8,95], изменению пропорций остальных категорий — −0,71 п.п.² с интервалом [−7,86; 6,74]. Их сумма составляет основные +5,17 п.п.². Положительный интервал отдельной дополнительной составляющей не меняет того, что интервал общего товарного вклада Японии включает ноль. Он помогает объяснить структуру точечной оценки, однако не заменяет результат первоначального сравнения. Рисунок 2.6 сопоставляет вклад доли памяти с вкладом пропорций остальных категорий.</w:t>
+        <w:t>Японское разложение показывает противоположное направление. Увеличению доли памяти соответствует вклад +5,88 п.п.² с интервалом [0,97; 8,95], изменению пропорций остальных категорий — −0,71 п.п.² с интервалом [−7,86; 6,74]. Их сумма составляет основные +5,17 п.п.². Интервал отдельной дополнительной составляющей лежит выше нуля, однако интервал общего товарного вклада Японии включает ноль. Поэтому детализация объясняет структуру точечной оценки и не заменяет результат первоначального сравнения. Рисунок 2.6 сопоставляет вклад доли памяти с вкладом пропорций остальных категорий.</w:t>
       </w:r>
     </w:p>
     <w:p>
@@ -6170,6 +6205,9 @@
       </w:r>
     </w:p>
     <w:p>
+      <w:pPr>
+        <w:keepNext/>
+      </w:pPr>
       <w:r>
         <w:t xml:space="preserve">Для определения направлений, формирующих эти величины, использована аддитивная атрибуция по ячейкам. При замене одного вектора весов </w:t>
       </w:r>
@@ -6592,7 +6630,7 @@
     </w:p>
     <w:p>
       <w:r>
-        <w:t>Основной результат раздела состоит в различии механизмов структурного сдвига двух экспортеров. У Кореи уменьшение доли памяти формирует большую часть отрицательного товарного вклада, который частично компенсируется положительной географической оценкой, связанной прежде всего с перекрестными ковариациями. У Японии товарная составляющая имеет положительную точечную оценку, географическая — отрицательную, а общий результат невелик. Достоверность содержательной интерпретации зависит от того, сохраняются ли эти соотношения при изменении географической сетки, способа измерения темпов и исторического окна. Поэтому далее рассматривается весь предусмотренный набор проверок устойчивости.</w:t>
+        <w:t>Разложение выявляет разные сочетания структурных вкладов у двух экспортеров. В Корее уменьшился вес памяти, чей фиксированный индекс заметно более волатилен, чем индекс остальных схем. Отрицательный товарный вклад частично компенсируется географической составляющей, преимущественно связанной с перераспределением весов совместных колебаний. В Японии доля памяти выросла; товарная и географическая точечные оценки имеют противоположные корейским знаки. Общие разности у обеих стран определены менее уверенно, чем отрицательный товарный вклад Кореи. Следующий раздел устанавливает, какие из этих соотношений сохраняются при изменении условий расчета.</w:t>
       </w:r>
     </w:p>
     <w:p>
@@ -6606,6 +6644,11 @@
     <w:p>
       <w:r>
         <w:t>Основная оценка характеризует определенный товарный охват, географическую сетку и историю темпов. Для установления границ полученных выводов необходимо проверить, как они меняются при изменении каждого из этих условий. Предусмотренный набор включает двенадцать вариантов, в том числе основной, для двух экспортеров. Из 24 сочетаний страны и варианта численный результат определен для 22. Два недоступных случая относятся к Корее и связаны с ненаблюдаемыми темпами. Все варианты рассматриваются совместно; они представляют связанные проверки на одной базе, а не независимые подтверждения одной гипотезы.</w:t>
+      </w:r>
+    </w:p>
+    <w:p>
+      <w:r>
+        <w:t>При оценке устойчивости важно различать изменение группировки данных и изменение самого измеряемого показателя. Сетки направлений и учет частей проверяют зависимость результата от охвата и агрегации. Другой лаг или обычный процентный темп задают уже иную меру динамики; отдельные временные окна характеризуют другую историю колебаний. Поэтому сохранение знака в таблице 2.5 означает устойчивость точечной оценки в соответствующем варианте, а не автоматически сохранение статистической определенности основного результата. Интервальная чувствительность рассматривается отдельно при изменении длины бутстреп-блока.</w:t>
       </w:r>
     </w:p>
     <w:p>
@@ -8231,7 +8274,7 @@
     </w:p>
     <w:p>
       <w:r>
-        <w:t>Дополнительное разложение общей матрицы ковариаций уточняет связь двух окон с полной оценкой. Полная матрица включает взвешенные внутрипериодные составляющие и составляющую различий средних темпов между окнами. В географическом результате Кореи им соответствуют −11,25; +95,75 и +14,34 п.п.². Их сумма воспроизводит основные +98,84 п.п.². Следовательно, положительный результат полной истории формируется преимущественно за счет совместных колебаний позднего периода; различия средних между окнами также дают положительную часть. Эти величины отличаются от отдельно рассчитанных вкладов −26,67 и +169,09 п.п.², поскольку в общей матрице внутрипериодные ковариации входят с соответствующими весами.</w:t>
+        <w:t>Дополнительное разложение общей матрицы ковариаций уточняет связь двух окон с полной оценкой. Полная матрица включает внутрипериодные составляющие с весами 35/83 и 47/83, определяемыми числом наблюдений и выборочным делителем, а также составляющую различий средних темпов между окнами. В географическом результате Кореи им соответствуют −11,25; +95,75 и +14,34 п.п.². Их сумма воспроизводит основные +98,84 п.п.². Следовательно, положительная оценка полной истории формируется преимущественно за счет внутрипериодной ковариационной матрицы 2021–2024 годов; различия средних также дают положительную часть. Это арифметическое разложение не устанавливает, какие события изменили совместную динамику потоков, и само по себе не является тестом структурного перелома.</w:t>
       </w:r>
     </w:p>
     <w:p>
@@ -8241,7 +8284,7 @@
     </w:p>
     <w:p>
       <w:r>
-        <w:t>Для проверки роли отдельных лет выполнено дополнительное последовательное исключение каждого года темпов с 2018 по 2024. В каждом расчете сохраняются исходные веса, сетка и 72 оставшихся месячных наблюдения. У Кореи общая разность стандартных отклонений остается отрицательной во всех семи случаях и находится в пределах от −1,98 до −0,38 п.п. Товарный вклад также отрицателен во всех исключениях. У Японии при исключении 2021 года знак меняется: разность становится +0,44 п.п. При исключении других лет оценки отрицательны. Следовательно, японский итог сильнее зависит от присутствия конкретного участка истории. Результаты последовательных исключений представлены на рисунке 2.8.</w:t>
+        <w:t>Для проверки роли отдельных лет выполнено дополнительное последовательное исключение каждого года темпов с 2018 по 2024. В каждом расчете сохраняются исходные веса, сетка и 72 оставшихся месячных наблюдения. У Кореи общая разность стандартных отклонений остается отрицательной во всех семи случаях и находится в пределах от −1,98 до −0,38 п.п. Товарный вклад также отрицателен во всех исключениях. У Японии при исключении 2021 года знак меняется: разность становится +0,44 п.п. При исключении других лет оценки отрицательны. Поэтому знак небольшого японского итога зависит от присутствия 2021 года; аналогичная смена знака у Кореи не наблюдается. Результаты последовательных исключений представлены на рисунке 2.8.</w:t>
       </w:r>
     </w:p>
     <w:p>
@@ -8408,22 +8451,22 @@
     </w:p>
     <w:p>
       <w:r>
-        <w:t>Границы вывода определяются и свойствами данных. Основная модель относится к номинальным долларовым стоимостям. Проведенная проверка ценовых источников пока не дает полной сопоставимой корректировки всех четырех HS6 для обеих стран с согласованными товарным охватом и валютой. Поэтому в работе не утверждается устойчивость результата после дефлятирования и не делается вывод о снижении волатильности физического выпуска. Таможенные партнеры также не охватывают все связи конечного спроса, а агрегированные категории не раскрывают технологические разновидности чипов. Эти ограничения задают содержание уже полученных оценок, не меняя их численного определения.</w:t>
+        <w:t>Границы вывода определяются и свойствами данных. Основная модель относится к номинальным долларовым стоимостям. В проверенных ценовых источниках не найден набор, обеспечивающий сопоставимое дефлятирование всех четырех HS6 для обеих стран с согласованными охватом и валютой. Поэтому результат характеризует изменчивость зарегистрированной стоимости поставок, включающей ценовую и валютную составляющие. О снижении волатильности физического выпуска по нему судить нельзя. Таможенные партнеры также не охватывают все связи конечного спроса, а агрегированные категории не раскрывают технологические разновидности чипов.</w:t>
       </w:r>
     </w:p>
     <w:p>
       <w:r>
-        <w:t>В результате анализа установлено, что корейская структура между 2017 и 2024 годами стала менее сосредоточенной на памяти и на крупнейших исходных направлениях. Японская структура, напротив, характеризовалась усилением товарной концентрации при небольшом снижении географической. Стоимость экспорта памяти выросла в обеих странах, поэтому движение ее доли необходимо рассматривать относительно динамики остальных категорий. Фактические колебания корейского экспорта при этом оставались существенно более выраженными.</w:t>
+        <w:t>Итоги главы позволяют дать определенный ответ на исследовательский вопрос. Переход от структуры 2017 года к структуре 2024 года дает небольшое точечное снижение условной волатильности у обеих стран, однако общие интервалы включают ноль. Наиболее отчетливый результат относится к товарной составляющей Кореи: ее вклад равен −172,92 п.п.², основной интервал расположен ниже нуля, а отрицательный знак сохраняется во всех доступных предусмотренных вариантах. Большая часть этой величины связана с уменьшением относительного веса памяти, чей индекс существенно более изменчив, чем индекс остальных схем. Стоимость экспорта памяти при этом выросла, поэтому установленное соотношение не требует трактовать диверсификацию как свертывание данной категории.</w:t>
       </w:r>
     </w:p>
     <w:p>
       <w:r>
-        <w:t>Основная модель показывает, что структурные изменения могут содержать противоположно направленные составляющие. У Кореи отрицательный товарный вклад имеет интервал, не включающий ноль, и преимущественно связан с уменьшением доли памяти. Положительная географическая оценка частично компенсирует этот результат, причем ее основная величина формируется перекрестными ковариациями. Для Японии знаки составляющих противоположны корейским, их масштаб меньше, а интервалы включают ноль. Общие интервалы изменения стандартного отклонения включают ноль у обеих стран.</w:t>
+        <w:t>Географическая составляющая Кореи в основной точечной оценке противодействует товарной и зависит от исторического окна. В Японии товарная и географическая составляющие имеют противоположные корейским знаки, но их основные интервалы включают ноль; знак итоговой разности меняется при исключении 2021 года и при других определениях темпа. Эти различия не позволяют приписать двум странам единый результат «диверсификация снизила волатильность». Установленный вклад исследования состоит в количественном раскрытии компенсирующих структурных составляющих и условий, при которых меняется их соотношение.</w:t>
       </w:r>
     </w:p>
     <w:p>
       <w:r>
-        <w:t>Проверки устойчивости позволяют разграничить эти выводы по степени определенности. Корейский отрицательный товарный вклад сохраняет знак при предусмотренных изменениях расчета, тогда как географический зависит от исторического окна. Японский общий результат чувствителен к определению темпа и присутствию 2021 года. Следовательно, сокращение концентрации не может выступать достаточным условием снижения волатильности. Для оценки экспортных приоритетов необходимо совместно учитывать товарную специализацию, распределение направлений и характер их колебаний. Эти результаты образуют аналитическую основу следующей главы, в которой рассматриваются рекомендации, условия их осуществимости и показатели контроля.</w:t>
+        <w:t>Для рекомендательной главы из анализа следуют конкретные основания: изменение доли памяти следует оценивать вместе с ростом остальных категорий, а перераспределение направлений — с их совместными колебаниями и положением в производственных цепочках. Уменьшение HHI может служить показателем изменения структуры, но не самостоятельным критерием устойчивости. Рассчитанные вклады также не задают целевые экспортные доли: выбор таких ориентиров требует учета спроса, издержек и производственных возможностей. На этих основаниях в следующей главе рассматриваются меры диверсификации, условия их осуществимости и показатели контроля.</w:t>
       </w:r>
     </w:p>
     <w:p>
@@ -21069,7 +21112,884 @@
         <w:pageBreakBefore/>
       </w:pPr>
       <w:r>
-        <w:t>Приложение Д Воспроизводимость расчетов</w:t>
+        <w:t>Приложение Д Изменчивость индексов памяти и остальных схем</w:t>
+      </w:r>
+    </w:p>
+    <w:p>
+      <w:r>
+        <w:t>Для каждого года весов построены два ряда на общей истории темпов 2018–2024 годов. Первый суммирует ячейки памяти с фиксированными долями направлений внутри HS854232. Второй объединяет три остальные категории с их географическими долями того же года; товарные веса внутри этой группы нормированы к единице. Это условные индексы, а не фактические темпы совокупного экспорта каждой группы.</w:t>
+      </w:r>
+    </w:p>
+    <w:p>
+      <w:pPr>
+        <w:keepNext/>
+        <w:spacing w:line="252" w:lineRule="auto" w:before="100" w:after="100"/>
+        <w:ind w:firstLine="0"/>
+        <w:jc w:val="left"/>
+      </w:pPr>
+      <w:r>
+        <w:rPr>
+          <w:rFonts w:ascii="Times New Roman" w:hAnsi="Times New Roman"/>
+          <w:b w:val="0"/>
+          <w:color w:val="000000"/>
+          <w:sz w:val="22"/>
+        </w:rPr>
+        <w:t>Таблица Д.1 — Волатильность и корреляция двух укрупненных индексов</w:t>
+      </w:r>
+    </w:p>
+    <w:tbl>
+      <w:tblPr>
+        <w:tblW w:type="auto" w:w="0"/>
+        <w:jc w:val="center"/>
+        <w:tblLayout w:type="fixed"/>
+        <w:tblLook w:firstColumn="1" w:firstRow="1" w:lastColumn="0" w:lastRow="0" w:noHBand="0" w:noVBand="1" w:val="04A0"/>
+        <w:tblBorders>
+          <w:top w:val="single" w:sz="5" w:color="D9D9D9"/>
+          <w:left w:val="single" w:sz="5" w:color="D9D9D9"/>
+          <w:bottom w:val="single" w:sz="5" w:color="D9D9D9"/>
+          <w:right w:val="single" w:sz="5" w:color="D9D9D9"/>
+          <w:insideH w:val="single" w:sz="5" w:color="D9D9D9"/>
+          <w:insideV w:val="single" w:sz="5" w:color="D9D9D9"/>
+        </w:tblBorders>
+      </w:tblPr>
+      <w:tblGrid>
+        <w:gridCol w:w="3685"/>
+        <w:gridCol w:w="1417"/>
+        <w:gridCol w:w="1417"/>
+        <w:gridCol w:w="1417"/>
+        <w:gridCol w:w="1417"/>
+      </w:tblGrid>
+      <w:tr>
+        <w:trPr>
+          <w:cantSplit/>
+          <w:tblHeader/>
+        </w:trPr>
+        <w:tc>
+          <w:tcPr>
+            <w:tcW w:type="dxa" w:w="3685"/>
+            <w:vAlign w:val="center"/>
+            <w:tcMar>
+              <w:top w:w="40" w:type="dxa"/>
+              <w:bottom w:w="40" w:type="dxa"/>
+              <w:left w:w="75" w:type="dxa"/>
+              <w:right w:w="75" w:type="dxa"/>
+            </w:tcMar>
+            <w:shd w:fill="EDEDED"/>
+          </w:tcPr>
+          <w:p>
+            <w:pPr>
+              <w:keepNext w:val="0"/>
+              <w:keepLines/>
+              <w:spacing w:line="240" w:lineRule="auto" w:before="0" w:after="0"/>
+              <w:ind w:firstLine="0"/>
+              <w:jc w:val="left"/>
+            </w:pPr>
+            <w:r>
+              <w:rPr>
+                <w:rFonts w:ascii="Times New Roman" w:hAnsi="Times New Roman"/>
+                <w:b/>
+                <w:color w:val="000000"/>
+                <w:sz w:val="21"/>
+              </w:rPr>
+              <w:t>Страна</w:t>
+            </w:r>
+          </w:p>
+        </w:tc>
+        <w:tc>
+          <w:tcPr>
+            <w:tcW w:type="dxa" w:w="1417"/>
+            <w:vAlign w:val="center"/>
+            <w:tcMar>
+              <w:top w:w="40" w:type="dxa"/>
+              <w:bottom w:w="40" w:type="dxa"/>
+              <w:left w:w="75" w:type="dxa"/>
+              <w:right w:w="75" w:type="dxa"/>
+            </w:tcMar>
+            <w:shd w:fill="EDEDED"/>
+          </w:tcPr>
+          <w:p>
+            <w:pPr>
+              <w:keepNext w:val="0"/>
+              <w:keepLines/>
+              <w:spacing w:line="240" w:lineRule="auto" w:before="0" w:after="0"/>
+              <w:ind w:firstLine="0"/>
+              <w:jc w:val="center"/>
+            </w:pPr>
+            <w:r>
+              <w:rPr>
+                <w:rFonts w:ascii="Times New Roman" w:hAnsi="Times New Roman"/>
+                <w:b/>
+                <w:color w:val="000000"/>
+                <w:sz w:val="21"/>
+              </w:rPr>
+              <w:t>Год весов</w:t>
+            </w:r>
+          </w:p>
+        </w:tc>
+        <w:tc>
+          <w:tcPr>
+            <w:tcW w:type="dxa" w:w="1417"/>
+            <w:vAlign w:val="center"/>
+            <w:tcMar>
+              <w:top w:w="40" w:type="dxa"/>
+              <w:bottom w:w="40" w:type="dxa"/>
+              <w:left w:w="75" w:type="dxa"/>
+              <w:right w:w="75" w:type="dxa"/>
+            </w:tcMar>
+            <w:shd w:fill="EDEDED"/>
+          </w:tcPr>
+          <w:p>
+            <w:pPr>
+              <w:keepNext w:val="0"/>
+              <w:keepLines/>
+              <w:spacing w:line="240" w:lineRule="auto" w:before="0" w:after="0"/>
+              <w:ind w:firstLine="0"/>
+              <w:jc w:val="center"/>
+            </w:pPr>
+            <w:r>
+              <w:rPr>
+                <w:rFonts w:ascii="Times New Roman" w:hAnsi="Times New Roman"/>
+                <w:b/>
+                <w:color w:val="000000"/>
+                <w:sz w:val="21"/>
+              </w:rPr>
+              <w:t>SD памяти, п.п.</w:t>
+            </w:r>
+          </w:p>
+        </w:tc>
+        <w:tc>
+          <w:tcPr>
+            <w:tcW w:type="dxa" w:w="1417"/>
+            <w:vAlign w:val="center"/>
+            <w:tcMar>
+              <w:top w:w="40" w:type="dxa"/>
+              <w:bottom w:w="40" w:type="dxa"/>
+              <w:left w:w="75" w:type="dxa"/>
+              <w:right w:w="75" w:type="dxa"/>
+            </w:tcMar>
+            <w:shd w:fill="EDEDED"/>
+          </w:tcPr>
+          <w:p>
+            <w:pPr>
+              <w:keepNext w:val="0"/>
+              <w:keepLines/>
+              <w:spacing w:line="240" w:lineRule="auto" w:before="0" w:after="0"/>
+              <w:ind w:firstLine="0"/>
+              <w:jc w:val="center"/>
+            </w:pPr>
+            <w:r>
+              <w:rPr>
+                <w:rFonts w:ascii="Times New Roman" w:hAnsi="Times New Roman"/>
+                <w:b/>
+                <w:color w:val="000000"/>
+                <w:sz w:val="21"/>
+              </w:rPr>
+              <w:t>SD остальных, п.п.</w:t>
+            </w:r>
+          </w:p>
+        </w:tc>
+        <w:tc>
+          <w:tcPr>
+            <w:tcW w:type="dxa" w:w="1417"/>
+            <w:vAlign w:val="center"/>
+            <w:tcMar>
+              <w:top w:w="40" w:type="dxa"/>
+              <w:bottom w:w="40" w:type="dxa"/>
+              <w:left w:w="75" w:type="dxa"/>
+              <w:right w:w="75" w:type="dxa"/>
+            </w:tcMar>
+            <w:shd w:fill="EDEDED"/>
+          </w:tcPr>
+          <w:p>
+            <w:pPr>
+              <w:keepNext w:val="0"/>
+              <w:keepLines/>
+              <w:spacing w:line="240" w:lineRule="auto" w:before="0" w:after="0"/>
+              <w:ind w:firstLine="0"/>
+              <w:jc w:val="center"/>
+            </w:pPr>
+            <w:r>
+              <w:rPr>
+                <w:rFonts w:ascii="Times New Roman" w:hAnsi="Times New Roman"/>
+                <w:b/>
+                <w:color w:val="000000"/>
+                <w:sz w:val="21"/>
+              </w:rPr>
+              <w:t>Корреляция</w:t>
+            </w:r>
+          </w:p>
+        </w:tc>
+      </w:tr>
+      <w:tr>
+        <w:trPr>
+          <w:cantSplit/>
+        </w:trPr>
+        <w:tc>
+          <w:tcPr>
+            <w:tcW w:type="dxa" w:w="3685"/>
+            <w:vAlign w:val="center"/>
+            <w:tcMar>
+              <w:top w:w="40" w:type="dxa"/>
+              <w:bottom w:w="40" w:type="dxa"/>
+              <w:left w:w="75" w:type="dxa"/>
+              <w:right w:w="75" w:type="dxa"/>
+            </w:tcMar>
+          </w:tcPr>
+          <w:p>
+            <w:pPr>
+              <w:keepNext w:val="0"/>
+              <w:keepLines/>
+              <w:spacing w:line="240" w:lineRule="auto" w:before="0" w:after="0"/>
+              <w:ind w:firstLine="0"/>
+              <w:jc w:val="left"/>
+            </w:pPr>
+            <w:r>
+              <w:rPr>
+                <w:rFonts w:ascii="Times New Roman" w:hAnsi="Times New Roman"/>
+                <w:b w:val="0"/>
+                <w:color w:val="000000"/>
+                <w:sz w:val="21"/>
+              </w:rPr>
+              <w:t>Япония</w:t>
+            </w:r>
+          </w:p>
+        </w:tc>
+        <w:tc>
+          <w:tcPr>
+            <w:tcW w:type="dxa" w:w="1417"/>
+            <w:vAlign w:val="center"/>
+            <w:tcMar>
+              <w:top w:w="40" w:type="dxa"/>
+              <w:bottom w:w="40" w:type="dxa"/>
+              <w:left w:w="75" w:type="dxa"/>
+              <w:right w:w="75" w:type="dxa"/>
+            </w:tcMar>
+          </w:tcPr>
+          <w:p>
+            <w:pPr>
+              <w:keepNext w:val="0"/>
+              <w:keepLines/>
+              <w:spacing w:line="240" w:lineRule="auto" w:before="0" w:after="0"/>
+              <w:ind w:firstLine="0"/>
+              <w:jc w:val="center"/>
+            </w:pPr>
+            <w:r>
+              <w:rPr>
+                <w:rFonts w:ascii="Times New Roman" w:hAnsi="Times New Roman"/>
+                <w:b w:val="0"/>
+                <w:color w:val="000000"/>
+                <w:sz w:val="21"/>
+              </w:rPr>
+              <w:t>2017</w:t>
+            </w:r>
+          </w:p>
+        </w:tc>
+        <w:tc>
+          <w:tcPr>
+            <w:tcW w:type="dxa" w:w="1417"/>
+            <w:vAlign w:val="center"/>
+            <w:tcMar>
+              <w:top w:w="40" w:type="dxa"/>
+              <w:bottom w:w="40" w:type="dxa"/>
+              <w:left w:w="75" w:type="dxa"/>
+              <w:right w:w="75" w:type="dxa"/>
+            </w:tcMar>
+          </w:tcPr>
+          <w:p>
+            <w:pPr>
+              <w:keepNext w:val="0"/>
+              <w:keepLines/>
+              <w:spacing w:line="240" w:lineRule="auto" w:before="0" w:after="0"/>
+              <w:ind w:firstLine="0"/>
+              <w:jc w:val="center"/>
+            </w:pPr>
+            <w:r>
+              <w:rPr>
+                <w:rFonts w:ascii="Times New Roman" w:hAnsi="Times New Roman"/>
+                <w:b w:val="0"/>
+                <w:color w:val="000000"/>
+                <w:sz w:val="21"/>
+              </w:rPr>
+              <w:t>19,31</w:t>
+            </w:r>
+          </w:p>
+        </w:tc>
+        <w:tc>
+          <w:tcPr>
+            <w:tcW w:type="dxa" w:w="1417"/>
+            <w:vAlign w:val="center"/>
+            <w:tcMar>
+              <w:top w:w="40" w:type="dxa"/>
+              <w:bottom w:w="40" w:type="dxa"/>
+              <w:left w:w="75" w:type="dxa"/>
+              <w:right w:w="75" w:type="dxa"/>
+            </w:tcMar>
+          </w:tcPr>
+          <w:p>
+            <w:pPr>
+              <w:keepNext w:val="0"/>
+              <w:keepLines/>
+              <w:spacing w:line="240" w:lineRule="auto" w:before="0" w:after="0"/>
+              <w:ind w:firstLine="0"/>
+              <w:jc w:val="center"/>
+            </w:pPr>
+            <w:r>
+              <w:rPr>
+                <w:rFonts w:ascii="Times New Roman" w:hAnsi="Times New Roman"/>
+                <w:b w:val="0"/>
+                <w:color w:val="000000"/>
+                <w:sz w:val="21"/>
+              </w:rPr>
+              <w:t>9,61</w:t>
+            </w:r>
+          </w:p>
+        </w:tc>
+        <w:tc>
+          <w:tcPr>
+            <w:tcW w:type="dxa" w:w="1417"/>
+            <w:vAlign w:val="center"/>
+            <w:tcMar>
+              <w:top w:w="40" w:type="dxa"/>
+              <w:bottom w:w="40" w:type="dxa"/>
+              <w:left w:w="75" w:type="dxa"/>
+              <w:right w:w="75" w:type="dxa"/>
+            </w:tcMar>
+          </w:tcPr>
+          <w:p>
+            <w:pPr>
+              <w:keepNext w:val="0"/>
+              <w:keepLines/>
+              <w:spacing w:line="240" w:lineRule="auto" w:before="0" w:after="0"/>
+              <w:ind w:firstLine="0"/>
+              <w:jc w:val="center"/>
+            </w:pPr>
+            <w:r>
+              <w:rPr>
+                <w:rFonts w:ascii="Times New Roman" w:hAnsi="Times New Roman"/>
+                <w:b w:val="0"/>
+                <w:color w:val="000000"/>
+                <w:sz w:val="21"/>
+              </w:rPr>
+              <w:t>0,11</w:t>
+            </w:r>
+          </w:p>
+        </w:tc>
+      </w:tr>
+      <w:tr>
+        <w:trPr>
+          <w:cantSplit/>
+        </w:trPr>
+        <w:tc>
+          <w:tcPr>
+            <w:tcW w:type="dxa" w:w="3685"/>
+            <w:vAlign w:val="center"/>
+            <w:tcMar>
+              <w:top w:w="40" w:type="dxa"/>
+              <w:bottom w:w="40" w:type="dxa"/>
+              <w:left w:w="75" w:type="dxa"/>
+              <w:right w:w="75" w:type="dxa"/>
+            </w:tcMar>
+          </w:tcPr>
+          <w:p>
+            <w:pPr>
+              <w:keepNext w:val="0"/>
+              <w:keepLines/>
+              <w:spacing w:line="240" w:lineRule="auto" w:before="0" w:after="0"/>
+              <w:ind w:firstLine="0"/>
+              <w:jc w:val="left"/>
+            </w:pPr>
+            <w:r>
+              <w:rPr>
+                <w:rFonts w:ascii="Times New Roman" w:hAnsi="Times New Roman"/>
+                <w:b w:val="0"/>
+                <w:color w:val="000000"/>
+                <w:sz w:val="21"/>
+              </w:rPr>
+              <w:t>Япония</w:t>
+            </w:r>
+          </w:p>
+        </w:tc>
+        <w:tc>
+          <w:tcPr>
+            <w:tcW w:type="dxa" w:w="1417"/>
+            <w:vAlign w:val="center"/>
+            <w:tcMar>
+              <w:top w:w="40" w:type="dxa"/>
+              <w:bottom w:w="40" w:type="dxa"/>
+              <w:left w:w="75" w:type="dxa"/>
+              <w:right w:w="75" w:type="dxa"/>
+            </w:tcMar>
+          </w:tcPr>
+          <w:p>
+            <w:pPr>
+              <w:keepNext w:val="0"/>
+              <w:keepLines/>
+              <w:spacing w:line="240" w:lineRule="auto" w:before="0" w:after="0"/>
+              <w:ind w:firstLine="0"/>
+              <w:jc w:val="center"/>
+            </w:pPr>
+            <w:r>
+              <w:rPr>
+                <w:rFonts w:ascii="Times New Roman" w:hAnsi="Times New Roman"/>
+                <w:b w:val="0"/>
+                <w:color w:val="000000"/>
+                <w:sz w:val="21"/>
+              </w:rPr>
+              <w:t>2024</w:t>
+            </w:r>
+          </w:p>
+        </w:tc>
+        <w:tc>
+          <w:tcPr>
+            <w:tcW w:type="dxa" w:w="1417"/>
+            <w:vAlign w:val="center"/>
+            <w:tcMar>
+              <w:top w:w="40" w:type="dxa"/>
+              <w:bottom w:w="40" w:type="dxa"/>
+              <w:left w:w="75" w:type="dxa"/>
+              <w:right w:w="75" w:type="dxa"/>
+            </w:tcMar>
+          </w:tcPr>
+          <w:p>
+            <w:pPr>
+              <w:keepNext w:val="0"/>
+              <w:keepLines/>
+              <w:spacing w:line="240" w:lineRule="auto" w:before="0" w:after="0"/>
+              <w:ind w:firstLine="0"/>
+              <w:jc w:val="center"/>
+            </w:pPr>
+            <w:r>
+              <w:rPr>
+                <w:rFonts w:ascii="Times New Roman" w:hAnsi="Times New Roman"/>
+                <w:b w:val="0"/>
+                <w:color w:val="000000"/>
+                <w:sz w:val="21"/>
+              </w:rPr>
+              <w:t>17,36</w:t>
+            </w:r>
+          </w:p>
+        </w:tc>
+        <w:tc>
+          <w:tcPr>
+            <w:tcW w:type="dxa" w:w="1417"/>
+            <w:vAlign w:val="center"/>
+            <w:tcMar>
+              <w:top w:w="40" w:type="dxa"/>
+              <w:bottom w:w="40" w:type="dxa"/>
+              <w:left w:w="75" w:type="dxa"/>
+              <w:right w:w="75" w:type="dxa"/>
+            </w:tcMar>
+          </w:tcPr>
+          <w:p>
+            <w:pPr>
+              <w:keepNext w:val="0"/>
+              <w:keepLines/>
+              <w:spacing w:line="240" w:lineRule="auto" w:before="0" w:after="0"/>
+              <w:ind w:firstLine="0"/>
+              <w:jc w:val="center"/>
+            </w:pPr>
+            <w:r>
+              <w:rPr>
+                <w:rFonts w:ascii="Times New Roman" w:hAnsi="Times New Roman"/>
+                <w:b w:val="0"/>
+                <w:color w:val="000000"/>
+                <w:sz w:val="21"/>
+              </w:rPr>
+              <w:t>10,03</w:t>
+            </w:r>
+          </w:p>
+        </w:tc>
+        <w:tc>
+          <w:tcPr>
+            <w:tcW w:type="dxa" w:w="1417"/>
+            <w:vAlign w:val="center"/>
+            <w:tcMar>
+              <w:top w:w="40" w:type="dxa"/>
+              <w:bottom w:w="40" w:type="dxa"/>
+              <w:left w:w="75" w:type="dxa"/>
+              <w:right w:w="75" w:type="dxa"/>
+            </w:tcMar>
+          </w:tcPr>
+          <w:p>
+            <w:pPr>
+              <w:keepNext w:val="0"/>
+              <w:keepLines/>
+              <w:spacing w:line="240" w:lineRule="auto" w:before="0" w:after="0"/>
+              <w:ind w:firstLine="0"/>
+              <w:jc w:val="center"/>
+            </w:pPr>
+            <w:r>
+              <w:rPr>
+                <w:rFonts w:ascii="Times New Roman" w:hAnsi="Times New Roman"/>
+                <w:b w:val="0"/>
+                <w:color w:val="000000"/>
+                <w:sz w:val="21"/>
+              </w:rPr>
+              <w:t>0,09</w:t>
+            </w:r>
+          </w:p>
+        </w:tc>
+      </w:tr>
+      <w:tr>
+        <w:trPr>
+          <w:cantSplit/>
+        </w:trPr>
+        <w:tc>
+          <w:tcPr>
+            <w:tcW w:type="dxa" w:w="3685"/>
+            <w:vAlign w:val="center"/>
+            <w:tcMar>
+              <w:top w:w="40" w:type="dxa"/>
+              <w:bottom w:w="40" w:type="dxa"/>
+              <w:left w:w="75" w:type="dxa"/>
+              <w:right w:w="75" w:type="dxa"/>
+            </w:tcMar>
+          </w:tcPr>
+          <w:p>
+            <w:pPr>
+              <w:keepNext w:val="0"/>
+              <w:keepLines/>
+              <w:spacing w:line="240" w:lineRule="auto" w:before="0" w:after="0"/>
+              <w:ind w:firstLine="0"/>
+              <w:jc w:val="left"/>
+            </w:pPr>
+            <w:r>
+              <w:rPr>
+                <w:rFonts w:ascii="Times New Roman" w:hAnsi="Times New Roman"/>
+                <w:b w:val="0"/>
+                <w:color w:val="000000"/>
+                <w:sz w:val="21"/>
+              </w:rPr>
+              <w:t>Республика Корея</w:t>
+            </w:r>
+          </w:p>
+        </w:tc>
+        <w:tc>
+          <w:tcPr>
+            <w:tcW w:type="dxa" w:w="1417"/>
+            <w:vAlign w:val="center"/>
+            <w:tcMar>
+              <w:top w:w="40" w:type="dxa"/>
+              <w:bottom w:w="40" w:type="dxa"/>
+              <w:left w:w="75" w:type="dxa"/>
+              <w:right w:w="75" w:type="dxa"/>
+            </w:tcMar>
+          </w:tcPr>
+          <w:p>
+            <w:pPr>
+              <w:keepNext w:val="0"/>
+              <w:keepLines/>
+              <w:spacing w:line="240" w:lineRule="auto" w:before="0" w:after="0"/>
+              <w:ind w:firstLine="0"/>
+              <w:jc w:val="center"/>
+            </w:pPr>
+            <w:r>
+              <w:rPr>
+                <w:rFonts w:ascii="Times New Roman" w:hAnsi="Times New Roman"/>
+                <w:b w:val="0"/>
+                <w:color w:val="000000"/>
+                <w:sz w:val="21"/>
+              </w:rPr>
+              <w:t>2017</w:t>
+            </w:r>
+          </w:p>
+        </w:tc>
+        <w:tc>
+          <w:tcPr>
+            <w:tcW w:type="dxa" w:w="1417"/>
+            <w:vAlign w:val="center"/>
+            <w:tcMar>
+              <w:top w:w="40" w:type="dxa"/>
+              <w:bottom w:w="40" w:type="dxa"/>
+              <w:left w:w="75" w:type="dxa"/>
+              <w:right w:w="75" w:type="dxa"/>
+            </w:tcMar>
+          </w:tcPr>
+          <w:p>
+            <w:pPr>
+              <w:keepNext w:val="0"/>
+              <w:keepLines/>
+              <w:spacing w:line="240" w:lineRule="auto" w:before="0" w:after="0"/>
+              <w:ind w:firstLine="0"/>
+              <w:jc w:val="center"/>
+            </w:pPr>
+            <w:r>
+              <w:rPr>
+                <w:rFonts w:ascii="Times New Roman" w:hAnsi="Times New Roman"/>
+                <w:b w:val="0"/>
+                <w:color w:val="000000"/>
+                <w:sz w:val="21"/>
+              </w:rPr>
+              <w:t>38,34</w:t>
+            </w:r>
+          </w:p>
+        </w:tc>
+        <w:tc>
+          <w:tcPr>
+            <w:tcW w:type="dxa" w:w="1417"/>
+            <w:vAlign w:val="center"/>
+            <w:tcMar>
+              <w:top w:w="40" w:type="dxa"/>
+              <w:bottom w:w="40" w:type="dxa"/>
+              <w:left w:w="75" w:type="dxa"/>
+              <w:right w:w="75" w:type="dxa"/>
+            </w:tcMar>
+          </w:tcPr>
+          <w:p>
+            <w:pPr>
+              <w:keepNext w:val="0"/>
+              <w:keepLines/>
+              <w:spacing w:line="240" w:lineRule="auto" w:before="0" w:after="0"/>
+              <w:ind w:firstLine="0"/>
+              <w:jc w:val="center"/>
+            </w:pPr>
+            <w:r>
+              <w:rPr>
+                <w:rFonts w:ascii="Times New Roman" w:hAnsi="Times New Roman"/>
+                <w:b w:val="0"/>
+                <w:color w:val="000000"/>
+                <w:sz w:val="21"/>
+              </w:rPr>
+              <w:t>16,42</w:t>
+            </w:r>
+          </w:p>
+        </w:tc>
+        <w:tc>
+          <w:tcPr>
+            <w:tcW w:type="dxa" w:w="1417"/>
+            <w:vAlign w:val="center"/>
+            <w:tcMar>
+              <w:top w:w="40" w:type="dxa"/>
+              <w:bottom w:w="40" w:type="dxa"/>
+              <w:left w:w="75" w:type="dxa"/>
+              <w:right w:w="75" w:type="dxa"/>
+            </w:tcMar>
+          </w:tcPr>
+          <w:p>
+            <w:pPr>
+              <w:keepNext w:val="0"/>
+              <w:keepLines/>
+              <w:spacing w:line="240" w:lineRule="auto" w:before="0" w:after="0"/>
+              <w:ind w:firstLine="0"/>
+              <w:jc w:val="center"/>
+            </w:pPr>
+            <w:r>
+              <w:rPr>
+                <w:rFonts w:ascii="Times New Roman" w:hAnsi="Times New Roman"/>
+                <w:b w:val="0"/>
+                <w:color w:val="000000"/>
+                <w:sz w:val="21"/>
+              </w:rPr>
+              <w:t>0,52</w:t>
+            </w:r>
+          </w:p>
+        </w:tc>
+      </w:tr>
+      <w:tr>
+        <w:trPr>
+          <w:cantSplit/>
+        </w:trPr>
+        <w:tc>
+          <w:tcPr>
+            <w:tcW w:type="dxa" w:w="3685"/>
+            <w:vAlign w:val="center"/>
+            <w:tcMar>
+              <w:top w:w="40" w:type="dxa"/>
+              <w:bottom w:w="40" w:type="dxa"/>
+              <w:left w:w="75" w:type="dxa"/>
+              <w:right w:w="75" w:type="dxa"/>
+            </w:tcMar>
+          </w:tcPr>
+          <w:p>
+            <w:pPr>
+              <w:keepNext/>
+              <w:keepLines/>
+              <w:spacing w:line="240" w:lineRule="auto" w:before="0" w:after="0"/>
+              <w:ind w:firstLine="0"/>
+              <w:jc w:val="left"/>
+            </w:pPr>
+            <w:r>
+              <w:rPr>
+                <w:rFonts w:ascii="Times New Roman" w:hAnsi="Times New Roman"/>
+                <w:b w:val="0"/>
+                <w:color w:val="000000"/>
+                <w:sz w:val="21"/>
+              </w:rPr>
+              <w:t>Республика Корея</w:t>
+            </w:r>
+          </w:p>
+        </w:tc>
+        <w:tc>
+          <w:tcPr>
+            <w:tcW w:type="dxa" w:w="1417"/>
+            <w:vAlign w:val="center"/>
+            <w:tcMar>
+              <w:top w:w="40" w:type="dxa"/>
+              <w:bottom w:w="40" w:type="dxa"/>
+              <w:left w:w="75" w:type="dxa"/>
+              <w:right w:w="75" w:type="dxa"/>
+            </w:tcMar>
+          </w:tcPr>
+          <w:p>
+            <w:pPr>
+              <w:keepNext/>
+              <w:keepLines/>
+              <w:spacing w:line="240" w:lineRule="auto" w:before="0" w:after="0"/>
+              <w:ind w:firstLine="0"/>
+              <w:jc w:val="center"/>
+            </w:pPr>
+            <w:r>
+              <w:rPr>
+                <w:rFonts w:ascii="Times New Roman" w:hAnsi="Times New Roman"/>
+                <w:b w:val="0"/>
+                <w:color w:val="000000"/>
+                <w:sz w:val="21"/>
+              </w:rPr>
+              <w:t>2024</w:t>
+            </w:r>
+          </w:p>
+        </w:tc>
+        <w:tc>
+          <w:tcPr>
+            <w:tcW w:type="dxa" w:w="1417"/>
+            <w:vAlign w:val="center"/>
+            <w:tcMar>
+              <w:top w:w="40" w:type="dxa"/>
+              <w:bottom w:w="40" w:type="dxa"/>
+              <w:left w:w="75" w:type="dxa"/>
+              <w:right w:w="75" w:type="dxa"/>
+            </w:tcMar>
+          </w:tcPr>
+          <w:p>
+            <w:pPr>
+              <w:keepNext/>
+              <w:keepLines/>
+              <w:spacing w:line="240" w:lineRule="auto" w:before="0" w:after="0"/>
+              <w:ind w:firstLine="0"/>
+              <w:jc w:val="center"/>
+            </w:pPr>
+            <w:r>
+              <w:rPr>
+                <w:rFonts w:ascii="Times New Roman" w:hAnsi="Times New Roman"/>
+                <w:b w:val="0"/>
+                <w:color w:val="000000"/>
+                <w:sz w:val="21"/>
+              </w:rPr>
+              <w:t>40,12</w:t>
+            </w:r>
+          </w:p>
+        </w:tc>
+        <w:tc>
+          <w:tcPr>
+            <w:tcW w:type="dxa" w:w="1417"/>
+            <w:vAlign w:val="center"/>
+            <w:tcMar>
+              <w:top w:w="40" w:type="dxa"/>
+              <w:bottom w:w="40" w:type="dxa"/>
+              <w:left w:w="75" w:type="dxa"/>
+              <w:right w:w="75" w:type="dxa"/>
+            </w:tcMar>
+          </w:tcPr>
+          <w:p>
+            <w:pPr>
+              <w:keepNext/>
+              <w:keepLines/>
+              <w:spacing w:line="240" w:lineRule="auto" w:before="0" w:after="0"/>
+              <w:ind w:firstLine="0"/>
+              <w:jc w:val="center"/>
+            </w:pPr>
+            <w:r>
+              <w:rPr>
+                <w:rFonts w:ascii="Times New Roman" w:hAnsi="Times New Roman"/>
+                <w:b w:val="0"/>
+                <w:color w:val="000000"/>
+                <w:sz w:val="21"/>
+              </w:rPr>
+              <w:t>18,78</w:t>
+            </w:r>
+          </w:p>
+        </w:tc>
+        <w:tc>
+          <w:tcPr>
+            <w:tcW w:type="dxa" w:w="1417"/>
+            <w:vAlign w:val="center"/>
+            <w:tcMar>
+              <w:top w:w="40" w:type="dxa"/>
+              <w:bottom w:w="40" w:type="dxa"/>
+              <w:left w:w="75" w:type="dxa"/>
+              <w:right w:w="75" w:type="dxa"/>
+            </w:tcMar>
+          </w:tcPr>
+          <w:p>
+            <w:pPr>
+              <w:keepNext/>
+              <w:keepLines/>
+              <w:spacing w:line="240" w:lineRule="auto" w:before="0" w:after="0"/>
+              <w:ind w:firstLine="0"/>
+              <w:jc w:val="center"/>
+            </w:pPr>
+            <w:r>
+              <w:rPr>
+                <w:rFonts w:ascii="Times New Roman" w:hAnsi="Times New Roman"/>
+                <w:b w:val="0"/>
+                <w:color w:val="000000"/>
+                <w:sz w:val="21"/>
+              </w:rPr>
+              <w:t>0,50</w:t>
+            </w:r>
+          </w:p>
+        </w:tc>
+      </w:tr>
+    </w:tbl>
+    <w:p>
+      <w:pPr>
+        <w:keepNext/>
+        <w:spacing w:line="240" w:lineRule="auto" w:before="60" w:after="80"/>
+        <w:ind w:firstLine="0"/>
+      </w:pPr>
+      <w:r>
+        <w:rPr>
+          <w:rFonts w:ascii="Times New Roman" w:hAnsi="Times New Roman"/>
+          <w:b w:val="0"/>
+          <w:color w:val="000000"/>
+          <w:sz w:val="20"/>
+        </w:rPr>
+        <w:t>Примечание: По 84 наблюдения для каждого ряда. Описательная детализация основной модели; отдельные интервалы для этих статистик не рассчитывались.</w:t>
+      </w:r>
+    </w:p>
+    <w:p>
+      <w:pPr>
+        <w:keepNext w:val="0"/>
+        <w:spacing w:line="240" w:lineRule="auto" w:before="60" w:after="80"/>
+        <w:ind w:firstLine="0"/>
+      </w:pPr>
+      <w:r>
+        <w:rPr>
+          <w:rFonts w:ascii="Times New Roman" w:hAnsi="Times New Roman"/>
+          <w:b w:val="0"/>
+          <w:color w:val="000000"/>
+          <w:sz w:val="20"/>
+        </w:rPr>
+        <w:t>Источник: расчеты автора по UN Comtrade.</w:t>
+      </w:r>
+    </w:p>
+    <w:p>
+      <w:r>
+        <w:t>Совокупный индекс точно восстанавливается как сумма индекса памяти, умноженного на ее долю, и индекса остальных схем, умноженного на оставшуюся долю. Его дисперсия равна сумме дисперсий групп с квадратами соответствующих весов и удвоенного произведения весов и ковариации групп. Для четырех сочетаний страны и года это равенство проверено по сохраненным основным оценкам.</w:t>
+      </w:r>
+    </w:p>
+    <w:p>
+      <w:r>
+        <w:t>Переход между строками 2017 и 2024 годов меняет географию и относительные пропорции остальных схем одновременно. Поэтому разность их стандартных отклонений не является отдельным вкладом доли памяти. Последний выделен вложенным разложением в разделе 2.3.</w:t>
+      </w:r>
+    </w:p>
+    <w:p>
+      <w:pPr>
+        <w:pStyle w:val="Heading1"/>
+        <w:pageBreakBefore/>
+      </w:pPr>
+      <w:r>
+        <w:t>Приложение Е Воспроизводимость расчетов</w:t>
       </w:r>
     </w:p>
     <w:p>
@@ -21178,7 +22098,7 @@
         <w:ind w:hanging="397" w:left="397"/>
       </w:pPr>
       <w:r>
-        <w:t>10. United Nations Statistics Division. UN Comtrade Database. Monthly export data, Japan and Republic of Korea, 2017–2024.</w:t>
+        <w:t>10. United Nations Statistics Division. Taiwan, Province of China Trade Data. UN Comtrade Help Center. Разъяснение кода 490; дата обращения 18 октября 2026 года.</w:t>
       </w:r>
     </w:p>
     <w:p>
@@ -21187,7 +22107,7 @@
         <w:ind w:hanging="397" w:left="397"/>
       </w:pPr>
       <w:r>
-        <w:t>11. World Customs Organization (2017). Harmonized System Nomenclature, Chapter 85, heading 85.42.</w:t>
+        <w:t>11. United Nations Statistics Division. UN Comtrade Database. Monthly export data, Japan and Republic of Korea, 2017–2024.</w:t>
       </w:r>
     </w:p>
     <w:p>
@@ -21196,7 +22116,16 @@
         <w:ind w:hanging="397" w:left="397"/>
       </w:pPr>
       <w:r>
-        <w:t>12. World Customs Organization (2022). Harmonized System Nomenclature, Chapter 85, heading 85.42.</w:t>
+        <w:t>12. World Customs Organization (2017). Harmonized System Nomenclature, Chapter 85, heading 85.42.</w:t>
+      </w:r>
+    </w:p>
+    <w:p>
+      <w:pPr>
+        <w:spacing w:line="276" w:lineRule="auto" w:after="100"/>
+        <w:ind w:hanging="397" w:left="397"/>
+      </w:pPr>
+      <w:r>
+        <w:t>13. World Customs Organization (2022). Harmonized System Nomenclature, Chapter 85, heading 85.42.</w:t>
       </w:r>
     </w:p>
     <w:sectPr>
@@ -21303,7 +22232,7 @@
         <w:footnoteRef/>
       </w:r>
       <w:r>
-        <w:t xml:space="preserve"> United Nations (2011). International Merchandise Trade Statistics: Concepts and Definitions 2010. Statistical Papers, Series M No. 52, Rev. 3. New York. Пункты 6.13–6.14, 6.24–6.25, с. 49, 51.</w:t>
+        <w:t xml:space="preserve"> United Nations (2011). International Merchandise Trade Statistics: Concepts and Definitions 2010. Statistical Papers, Series M No. 52, Rev. 3. New York. Пункты 6.13–6.14, 6.24–6.25, с. 49, 51; United Nations Statistics Division. Taiwan, Province of China Trade Data. UN Comtrade Help Center. Разъяснение кода 490, проверено 18 октября 2026 года.</w:t>
       </w:r>
     </w:p>
   </w:footnote>

</xml_diff>